<commit_message>
Add new file in project
</commit_message>
<xml_diff>
--- a/Тех оснастка/ПЗ.docx
+++ b/Тех оснастка/ПЗ.docx
@@ -14210,18 +14210,7 @@
           <w:dstrike w:val="0"/>
           <w:lang w:val="en-US"/>
         </w:rPr>
-        <w:t>Благода</w:t>
-      </w:r>
-      <w:bookmarkStart w:id="12" w:name="_GoBack"/>
-      <w:bookmarkEnd w:id="12"/>
-      <w:r>
-        <w:rPr>
-          <w:rFonts w:hint="default" w:cs="Times New Roman"/>
-          <w:strike w:val="0"/>
-          <w:dstrike w:val="0"/>
-          <w:lang w:val="en-US"/>
-        </w:rPr>
-        <w:t>ря</w:t>
+        <w:t>Благодаря</w:t>
       </w:r>
       <w:r>
         <w:rPr>
@@ -16791,23 +16780,67 @@
         <w:textAlignment w:val="auto"/>
         <w:rPr>
           <w:rFonts w:hint="default" w:ascii="Times New Roman" w:hAnsi="Times New Roman" w:cs="Times New Roman"/>
-          <w:strike/>
-          <w:dstrike w:val="0"/>
-          <w:sz w:val="28"/>
-          <w:szCs w:val="28"/>
-        </w:rPr>
-      </w:pPr>
-      <w:r>
-        <w:rPr>
-          <w:rFonts w:hint="default" w:ascii="Times New Roman" w:hAnsi="Times New Roman" w:cs="Times New Roman"/>
-          <w:strike/>
-          <w:dstrike w:val="0"/>
-          <w:sz w:val="28"/>
-          <w:szCs w:val="28"/>
-        </w:rPr>
-        <w:t>Необходимо спроектировать приспособление для фрезерования лыски в детали «Опора».</w:t>
-      </w:r>
-    </w:p>
+          <w:strike w:val="0"/>
+          <w:dstrike w:val="0"/>
+          <w:sz w:val="28"/>
+          <w:szCs w:val="28"/>
+        </w:rPr>
+      </w:pPr>
+      <w:bookmarkStart w:id="12" w:name="_GoBack"/>
+      <w:r>
+        <w:rPr>
+          <w:rFonts w:hint="default" w:ascii="Times New Roman" w:hAnsi="Times New Roman" w:cs="Times New Roman"/>
+          <w:strike w:val="0"/>
+          <w:dstrike w:val="0"/>
+          <w:sz w:val="28"/>
+          <w:szCs w:val="28"/>
+        </w:rPr>
+        <w:t xml:space="preserve">Необходимо спроектировать приспособление для фрезерования </w:t>
+      </w:r>
+      <w:r>
+        <w:rPr>
+          <w:rFonts w:hint="default" w:cs="Times New Roman"/>
+          <w:strike w:val="0"/>
+          <w:dstrike w:val="0"/>
+          <w:sz w:val="28"/>
+          <w:szCs w:val="28"/>
+          <w:lang w:val="ru-RU"/>
+        </w:rPr>
+        <w:t>шпоночного паза</w:t>
+      </w:r>
+      <w:r>
+        <w:rPr>
+          <w:rFonts w:hint="default" w:ascii="Times New Roman" w:hAnsi="Times New Roman" w:cs="Times New Roman"/>
+          <w:strike w:val="0"/>
+          <w:dstrike w:val="0"/>
+          <w:sz w:val="28"/>
+          <w:szCs w:val="28"/>
+        </w:rPr>
+        <w:t xml:space="preserve"> в детали «</w:t>
+      </w:r>
+      <w:r>
+        <w:rPr>
+          <w:rFonts w:hint="default" w:cs="Times New Roman"/>
+          <w:strike w:val="0"/>
+          <w:dstrike w:val="0"/>
+          <w:sz w:val="28"/>
+          <w:szCs w:val="28"/>
+          <w:lang w:val="ru-RU"/>
+        </w:rPr>
+        <w:t>Вал</w:t>
+      </w:r>
+      <w:r>
+        <w:rPr>
+          <w:rFonts w:hint="default" w:ascii="Times New Roman" w:hAnsi="Times New Roman" w:cs="Times New Roman"/>
+          <w:strike w:val="0"/>
+          <w:dstrike w:val="0"/>
+          <w:sz w:val="28"/>
+          <w:szCs w:val="28"/>
+        </w:rPr>
+        <w:t>».</w:t>
+      </w:r>
+    </w:p>
+    <w:bookmarkEnd w:id="12"/>
     <w:p>
       <w:pPr>
         <w:keepLines w:val="0"/>
@@ -16941,35 +16974,63 @@
         <w:adjustRightInd/>
         <w:snapToGrid/>
         <w:spacing w:line="288" w:lineRule="auto"/>
-        <w:ind w:hanging="426"/>
         <w:jc w:val="center"/>
         <w:textAlignment w:val="auto"/>
         <w:rPr>
           <w:rFonts w:hint="default" w:ascii="Times New Roman" w:hAnsi="Times New Roman" w:cs="Times New Roman"/>
           <w:strike/>
           <w:dstrike w:val="0"/>
-        </w:rPr>
-      </w:pPr>
-      <w:r>
-        <w:rPr>
-          <w:rFonts w:hint="default" w:ascii="Times New Roman" w:hAnsi="Times New Roman" w:cs="Times New Roman"/>
-          <w:strike/>
-          <w:dstrike w:val="0"/>
-        </w:rPr>
-        <w:object>
-          <v:shape id="_x0000_i1029" o:spt="75" type="#_x0000_t75" style="height:537.7pt;width:522.9pt;" o:ole="t" filled="f" o:preferrelative="t" stroked="f" coordsize="21600,21600">
-            <v:path/>
-            <v:fill on="f" alignshape="1" focussize="0,0"/>
-            <v:stroke on="f"/>
-            <v:imagedata r:id="rId15" grayscale="f" bilevel="f" o:title=""/>
-            <o:lock v:ext="edit" aspectratio="t"/>
-            <w10:wrap type="none"/>
-            <w10:anchorlock/>
-          </v:shape>
-          <o:OLEObject Type="Embed" ProgID="AutoCAD.Drawing.23" ShapeID="_x0000_i1029" DrawAspect="Content" ObjectID="_1468075729" r:id="rId14">
-            <o:LockedField>false</o:LockedField>
-          </o:OLEObject>
-        </w:object>
+          <w:sz w:val="28"/>
+          <w:szCs w:val="28"/>
+          <w:lang w:val="ru-RU"/>
+        </w:rPr>
+      </w:pPr>
+      <w:r>
+        <w:rPr>
+          <w:rFonts w:hint="default" w:ascii="Times New Roman" w:hAnsi="Times New Roman" w:cs="Times New Roman"/>
+          <w:strike/>
+          <w:dstrike w:val="0"/>
+          <w:sz w:val="28"/>
+          <w:szCs w:val="28"/>
+          <w:lang w:val="ru-RU"/>
+        </w:rPr>
+        <w:drawing>
+          <wp:inline distT="0" distB="0" distL="114300" distR="114300">
+            <wp:extent cx="5605780" cy="8797290"/>
+            <wp:effectExtent l="0" t="0" r="13970" b="3810"/>
+            <wp:docPr id="8" name="Изображение 8" descr="Screenshot_15"/>
+            <wp:cNvGraphicFramePr>
+              <a:graphicFrameLocks xmlns:a="http://schemas.openxmlformats.org/drawingml/2006/main" noChangeAspect="1"/>
+            </wp:cNvGraphicFramePr>
+            <a:graphic xmlns:a="http://schemas.openxmlformats.org/drawingml/2006/main">
+              <a:graphicData uri="http://schemas.openxmlformats.org/drawingml/2006/picture">
+                <pic:pic xmlns:pic="http://schemas.openxmlformats.org/drawingml/2006/picture">
+                  <pic:nvPicPr>
+                    <pic:cNvPr id="8" name="Изображение 8" descr="Screenshot_15"/>
+                    <pic:cNvPicPr>
+                      <a:picLocks noChangeAspect="1"/>
+                    </pic:cNvPicPr>
+                  </pic:nvPicPr>
+                  <pic:blipFill>
+                    <a:blip r:embed="rId14"/>
+                    <a:stretch>
+                      <a:fillRect/>
+                    </a:stretch>
+                  </pic:blipFill>
+                  <pic:spPr>
+                    <a:xfrm>
+                      <a:off x="0" y="0"/>
+                      <a:ext cx="5605780" cy="8797290"/>
+                    </a:xfrm>
+                    <a:prstGeom prst="rect">
+                      <a:avLst/>
+                    </a:prstGeom>
+                  </pic:spPr>
+                </pic:pic>
+              </a:graphicData>
+            </a:graphic>
+          </wp:inline>
+        </w:drawing>
       </w:r>
     </w:p>
     <w:p>
@@ -16991,42 +17052,16 @@
         <w:textAlignment w:val="auto"/>
         <w:rPr>
           <w:rFonts w:hint="default" w:ascii="Times New Roman" w:hAnsi="Times New Roman" w:cs="Times New Roman"/>
-          <w:strike/>
-          <w:dstrike w:val="0"/>
-          <w:sz w:val="28"/>
-          <w:szCs w:val="28"/>
-        </w:rPr>
-      </w:pPr>
-    </w:p>
-    <w:p>
-      <w:pPr>
-        <w:keepLines w:val="0"/>
-        <w:pageBreakBefore w:val="0"/>
-        <w:widowControl/>
-        <w:kinsoku/>
-        <w:wordWrap/>
-        <w:overflowPunct/>
-        <w:topLinePunct w:val="0"/>
-        <w:autoSpaceDE/>
-        <w:autoSpaceDN/>
-        <w:bidi w:val="0"/>
-        <w:adjustRightInd/>
-        <w:snapToGrid/>
-        <w:spacing w:line="288" w:lineRule="auto"/>
-        <w:jc w:val="center"/>
-        <w:textAlignment w:val="auto"/>
-        <w:rPr>
-          <w:rFonts w:hint="default" w:ascii="Times New Roman" w:hAnsi="Times New Roman" w:cs="Times New Roman"/>
-          <w:strike/>
-          <w:dstrike w:val="0"/>
-          <w:sz w:val="28"/>
-          <w:szCs w:val="28"/>
-        </w:rPr>
-      </w:pPr>
-      <w:r>
-        <w:rPr>
-          <w:rFonts w:hint="default" w:ascii="Times New Roman" w:hAnsi="Times New Roman" w:cs="Times New Roman"/>
-          <w:strike/>
+          <w:strike w:val="0"/>
+          <w:dstrike w:val="0"/>
+          <w:sz w:val="28"/>
+          <w:szCs w:val="28"/>
+        </w:rPr>
+      </w:pPr>
+      <w:r>
+        <w:rPr>
+          <w:rFonts w:hint="default" w:ascii="Times New Roman" w:hAnsi="Times New Roman" w:cs="Times New Roman"/>
+          <w:strike w:val="0"/>
           <w:dstrike w:val="0"/>
           <w:sz w:val="28"/>
           <w:szCs w:val="28"/>
@@ -17289,7 +17324,7 @@
                     </pic:cNvPicPr>
                   </pic:nvPicPr>
                   <pic:blipFill>
-                    <a:blip r:embed="rId16"/>
+                    <a:blip r:embed="rId15"/>
                     <a:srcRect l="39006" t="49408" r="42493" b="28769"/>
                     <a:stretch>
                       <a:fillRect/>
@@ -17474,12 +17509,12 @@
             <v:path/>
             <v:fill on="f" alignshape="1" focussize="0,0"/>
             <v:stroke on="f"/>
-            <v:imagedata r:id="rId18" grayscale="f" bilevel="f" o:title=""/>
+            <v:imagedata r:id="rId17" grayscale="f" bilevel="f" o:title=""/>
             <o:lock v:ext="edit" aspectratio="t"/>
             <w10:wrap type="none"/>
             <w10:anchorlock/>
           </v:shape>
-          <o:OLEObject Type="Embed" ProgID="Equation.3" ShapeID="_x0000_i1030" DrawAspect="Content" ObjectID="_1468075730" r:id="rId17">
+          <o:OLEObject Type="Embed" ProgID="Equation.3" ShapeID="_x0000_i1030" DrawAspect="Content" ObjectID="_1468075729" r:id="rId16">
             <o:LockedField>false</o:LockedField>
           </o:OLEObject>
         </w:object>
@@ -17601,12 +17636,12 @@
             <v:path/>
             <v:fill on="f" alignshape="1" focussize="0,0"/>
             <v:stroke on="f"/>
-            <v:imagedata r:id="rId20" grayscale="f" bilevel="f" o:title=""/>
+            <v:imagedata r:id="rId19" grayscale="f" bilevel="f" o:title=""/>
             <o:lock v:ext="edit" aspectratio="t"/>
             <w10:wrap type="none"/>
             <w10:anchorlock/>
           </v:shape>
-          <o:OLEObject Type="Embed" ProgID="Equation.3" ShapeID="_x0000_i1031" DrawAspect="Content" ObjectID="_1468075731" r:id="rId19">
+          <o:OLEObject Type="Embed" ProgID="Equation.3" ShapeID="_x0000_i1031" DrawAspect="Content" ObjectID="_1468075730" r:id="rId18">
             <o:LockedField>false</o:LockedField>
           </o:OLEObject>
         </w:object>
@@ -17699,12 +17734,12 @@
             <v:path/>
             <v:fill on="f" focussize="0,0"/>
             <v:stroke on="f"/>
-            <v:imagedata r:id="rId22" o:title=""/>
+            <v:imagedata r:id="rId21" o:title=""/>
             <o:lock v:ext="edit" aspectratio="t"/>
             <w10:wrap type="none"/>
             <w10:anchorlock/>
           </v:shape>
-          <o:OLEObject Type="Embed" ProgID="Equation.3" ShapeID="_x0000_i1032" DrawAspect="Content" ObjectID="_1468075732" r:id="rId21">
+          <o:OLEObject Type="Embed" ProgID="Equation.3" ShapeID="_x0000_i1032" DrawAspect="Content" ObjectID="_1468075731" r:id="rId20">
             <o:LockedField>false</o:LockedField>
           </o:OLEObject>
         </w:object>
@@ -17733,12 +17768,12 @@
             <v:path/>
             <v:fill on="f" focussize="0,0"/>
             <v:stroke on="f"/>
-            <v:imagedata r:id="rId24" o:title=""/>
+            <v:imagedata r:id="rId23" o:title=""/>
             <o:lock v:ext="edit" aspectratio="t"/>
             <w10:wrap type="none"/>
             <w10:anchorlock/>
           </v:shape>
-          <o:OLEObject Type="Embed" ProgID="Equation.3" ShapeID="_x0000_i1033" DrawAspect="Content" ObjectID="_1468075733" r:id="rId23">
+          <o:OLEObject Type="Embed" ProgID="Equation.3" ShapeID="_x0000_i1033" DrawAspect="Content" ObjectID="_1468075732" r:id="rId22">
             <o:LockedField>false</o:LockedField>
           </o:OLEObject>
         </w:object>
@@ -17804,12 +17839,12 @@
             <v:path/>
             <v:fill on="f" focussize="0,0"/>
             <v:stroke on="f"/>
-            <v:imagedata r:id="rId26" o:title=""/>
+            <v:imagedata r:id="rId25" o:title=""/>
             <o:lock v:ext="edit" aspectratio="t"/>
             <w10:wrap type="none"/>
             <w10:anchorlock/>
           </v:shape>
-          <o:OLEObject Type="Embed" ProgID="Equation.3" ShapeID="_x0000_i1034" DrawAspect="Content" ObjectID="_1468075734" r:id="rId25">
+          <o:OLEObject Type="Embed" ProgID="Equation.3" ShapeID="_x0000_i1034" DrawAspect="Content" ObjectID="_1468075733" r:id="rId24">
             <o:LockedField>false</o:LockedField>
           </o:OLEObject>
         </w:object>
@@ -17838,12 +17873,12 @@
             <v:path/>
             <v:fill on="f" focussize="0,0"/>
             <v:stroke on="f"/>
-            <v:imagedata r:id="rId28" o:title=""/>
+            <v:imagedata r:id="rId27" o:title=""/>
             <o:lock v:ext="edit" aspectratio="t"/>
             <w10:wrap type="none"/>
             <w10:anchorlock/>
           </v:shape>
-          <o:OLEObject Type="Embed" ProgID="Equation.3" ShapeID="_x0000_i1035" DrawAspect="Content" ObjectID="_1468075735" r:id="rId27">
+          <o:OLEObject Type="Embed" ProgID="Equation.3" ShapeID="_x0000_i1035" DrawAspect="Content" ObjectID="_1468075734" r:id="rId26">
             <o:LockedField>false</o:LockedField>
           </o:OLEObject>
         </w:object>
@@ -17909,12 +17944,12 @@
             <v:path/>
             <v:fill on="f" focussize="0,0"/>
             <v:stroke on="f"/>
-            <v:imagedata r:id="rId30" o:title=""/>
+            <v:imagedata r:id="rId29" o:title=""/>
             <o:lock v:ext="edit" aspectratio="t"/>
             <w10:wrap type="none"/>
             <w10:anchorlock/>
           </v:shape>
-          <o:OLEObject Type="Embed" ProgID="Equation.3" ShapeID="_x0000_i1036" DrawAspect="Content" ObjectID="_1468075736" r:id="rId29">
+          <o:OLEObject Type="Embed" ProgID="Equation.3" ShapeID="_x0000_i1036" DrawAspect="Content" ObjectID="_1468075735" r:id="rId28">
             <o:LockedField>false</o:LockedField>
           </o:OLEObject>
         </w:object>
@@ -17943,12 +17978,12 @@
             <v:path/>
             <v:fill on="f" focussize="0,0"/>
             <v:stroke on="f"/>
-            <v:imagedata r:id="rId32" o:title=""/>
+            <v:imagedata r:id="rId31" o:title=""/>
             <o:lock v:ext="edit" aspectratio="t"/>
             <w10:wrap type="none"/>
             <w10:anchorlock/>
           </v:shape>
-          <o:OLEObject Type="Embed" ProgID="Equation.3" ShapeID="_x0000_i1037" DrawAspect="Content" ObjectID="_1468075737" r:id="rId31">
+          <o:OLEObject Type="Embed" ProgID="Equation.3" ShapeID="_x0000_i1037" DrawAspect="Content" ObjectID="_1468075736" r:id="rId30">
             <o:LockedField>false</o:LockedField>
           </o:OLEObject>
         </w:object>
@@ -18014,12 +18049,12 @@
             <v:path/>
             <v:fill on="f" focussize="0,0"/>
             <v:stroke on="f"/>
-            <v:imagedata r:id="rId34" o:title=""/>
+            <v:imagedata r:id="rId33" o:title=""/>
             <o:lock v:ext="edit" aspectratio="t"/>
             <w10:wrap type="none"/>
             <w10:anchorlock/>
           </v:shape>
-          <o:OLEObject Type="Embed" ProgID="Equation.3" ShapeID="_x0000_i1038" DrawAspect="Content" ObjectID="_1468075738" r:id="rId33">
+          <o:OLEObject Type="Embed" ProgID="Equation.3" ShapeID="_x0000_i1038" DrawAspect="Content" ObjectID="_1468075737" r:id="rId32">
             <o:LockedField>false</o:LockedField>
           </o:OLEObject>
         </w:object>
@@ -18048,12 +18083,12 @@
             <v:path/>
             <v:fill on="f" focussize="0,0"/>
             <v:stroke on="f"/>
-            <v:imagedata r:id="rId36" o:title=""/>
+            <v:imagedata r:id="rId35" o:title=""/>
             <o:lock v:ext="edit" aspectratio="t"/>
             <w10:wrap type="none"/>
             <w10:anchorlock/>
           </v:shape>
-          <o:OLEObject Type="Embed" ProgID="Equation.3" ShapeID="_x0000_i1039" DrawAspect="Content" ObjectID="_1468075739" r:id="rId35">
+          <o:OLEObject Type="Embed" ProgID="Equation.3" ShapeID="_x0000_i1039" DrawAspect="Content" ObjectID="_1468075738" r:id="rId34">
             <o:LockedField>false</o:LockedField>
           </o:OLEObject>
         </w:object>
@@ -18119,12 +18154,12 @@
             <v:path/>
             <v:fill on="f" focussize="0,0"/>
             <v:stroke on="f"/>
-            <v:imagedata r:id="rId38" o:title=""/>
+            <v:imagedata r:id="rId37" o:title=""/>
             <o:lock v:ext="edit" aspectratio="t"/>
             <w10:wrap type="none"/>
             <w10:anchorlock/>
           </v:shape>
-          <o:OLEObject Type="Embed" ProgID="Equation.3" ShapeID="_x0000_i1040" DrawAspect="Content" ObjectID="_1468075740" r:id="rId37">
+          <o:OLEObject Type="Embed" ProgID="Equation.3" ShapeID="_x0000_i1040" DrawAspect="Content" ObjectID="_1468075739" r:id="rId36">
             <o:LockedField>false</o:LockedField>
           </o:OLEObject>
         </w:object>
@@ -18153,12 +18188,12 @@
             <v:path/>
             <v:fill on="f" focussize="0,0"/>
             <v:stroke on="f"/>
-            <v:imagedata r:id="rId38" o:title=""/>
+            <v:imagedata r:id="rId37" o:title=""/>
             <o:lock v:ext="edit" aspectratio="t"/>
             <w10:wrap type="none"/>
             <w10:anchorlock/>
           </v:shape>
-          <o:OLEObject Type="Embed" ProgID="Equation.3" ShapeID="_x0000_i1041" DrawAspect="Content" ObjectID="_1468075741" r:id="rId39">
+          <o:OLEObject Type="Embed" ProgID="Equation.3" ShapeID="_x0000_i1041" DrawAspect="Content" ObjectID="_1468075740" r:id="rId38">
             <o:LockedField>false</o:LockedField>
           </o:OLEObject>
         </w:object>
@@ -18224,12 +18259,12 @@
             <v:path/>
             <v:fill on="f" focussize="0,0"/>
             <v:stroke on="f"/>
-            <v:imagedata r:id="rId41" o:title=""/>
+            <v:imagedata r:id="rId40" o:title=""/>
             <o:lock v:ext="edit" aspectratio="t"/>
             <w10:wrap type="none"/>
             <w10:anchorlock/>
           </v:shape>
-          <o:OLEObject Type="Embed" ProgID="Equation.3" ShapeID="_x0000_i1042" DrawAspect="Content" ObjectID="_1468075742" r:id="rId40">
+          <o:OLEObject Type="Embed" ProgID="Equation.3" ShapeID="_x0000_i1042" DrawAspect="Content" ObjectID="_1468075741" r:id="rId39">
             <o:LockedField>false</o:LockedField>
           </o:OLEObject>
         </w:object>
@@ -18258,12 +18293,12 @@
             <v:path/>
             <v:fill on="f" focussize="0,0"/>
             <v:stroke on="f"/>
-            <v:imagedata r:id="rId41" o:title=""/>
+            <v:imagedata r:id="rId40" o:title=""/>
             <o:lock v:ext="edit" aspectratio="t"/>
             <w10:wrap type="none"/>
             <w10:anchorlock/>
           </v:shape>
-          <o:OLEObject Type="Embed" ProgID="Equation.3" ShapeID="_x0000_i1043" DrawAspect="Content" ObjectID="_1468075743" r:id="rId42">
+          <o:OLEObject Type="Embed" ProgID="Equation.3" ShapeID="_x0000_i1043" DrawAspect="Content" ObjectID="_1468075742" r:id="rId41">
             <o:LockedField>false</o:LockedField>
           </o:OLEObject>
         </w:object>
@@ -18347,12 +18382,12 @@
             <v:path/>
             <v:fill on="f" alignshape="1" focussize="0,0"/>
             <v:stroke on="f"/>
-            <v:imagedata r:id="rId44" grayscale="f" bilevel="f" o:title=""/>
+            <v:imagedata r:id="rId43" grayscale="f" bilevel="f" o:title=""/>
             <o:lock v:ext="edit" aspectratio="t"/>
             <w10:wrap type="none"/>
             <w10:anchorlock/>
           </v:shape>
-          <o:OLEObject Type="Embed" ProgID="Equation.DSMT4" ShapeID="_x0000_i1044" DrawAspect="Content" ObjectID="_1468075744" r:id="rId43">
+          <o:OLEObject Type="Embed" ProgID="Equation.DSMT4" ShapeID="_x0000_i1044" DrawAspect="Content" ObjectID="_1468075743" r:id="rId42">
             <o:LockedField>false</o:LockedField>
           </o:OLEObject>
         </w:object>
@@ -18470,12 +18505,12 @@
             <v:path/>
             <v:fill on="f" alignshape="1" focussize="0,0"/>
             <v:stroke on="f"/>
-            <v:imagedata r:id="rId46" grayscale="f" bilevel="f" o:title=""/>
+            <v:imagedata r:id="rId45" grayscale="f" bilevel="f" o:title=""/>
             <o:lock v:ext="edit" aspectratio="t"/>
             <w10:wrap type="none"/>
             <w10:anchorlock/>
           </v:shape>
-          <o:OLEObject Type="Embed" ProgID="Equation.DSMT4" ShapeID="_x0000_i1045" DrawAspect="Content" ObjectID="_1468075745" r:id="rId45">
+          <o:OLEObject Type="Embed" ProgID="Equation.DSMT4" ShapeID="_x0000_i1045" DrawAspect="Content" ObjectID="_1468075744" r:id="rId44">
             <o:LockedField>false</o:LockedField>
           </o:OLEObject>
         </w:object>
@@ -18520,12 +18555,12 @@
             <v:path/>
             <v:fill on="f" alignshape="1" focussize="0,0"/>
             <v:stroke on="f"/>
-            <v:imagedata r:id="rId48" grayscale="f" bilevel="f" o:title=""/>
+            <v:imagedata r:id="rId47" grayscale="f" bilevel="f" o:title=""/>
             <o:lock v:ext="edit" aspectratio="t"/>
             <w10:wrap type="none"/>
             <w10:anchorlock/>
           </v:shape>
-          <o:OLEObject Type="Embed" ProgID="Equation.DSMT4" ShapeID="_x0000_i1046" DrawAspect="Content" ObjectID="_1468075746" r:id="rId47">
+          <o:OLEObject Type="Embed" ProgID="Equation.DSMT4" ShapeID="_x0000_i1046" DrawAspect="Content" ObjectID="_1468075745" r:id="rId46">
             <o:LockedField>false</o:LockedField>
           </o:OLEObject>
         </w:object>
@@ -18683,12 +18718,12 @@
             <v:path/>
             <v:fill on="f" alignshape="1" focussize="0,0"/>
             <v:stroke on="f"/>
-            <v:imagedata r:id="rId50" grayscale="f" bilevel="f" o:title=""/>
+            <v:imagedata r:id="rId49" grayscale="f" bilevel="f" o:title=""/>
             <o:lock v:ext="edit" aspectratio="t"/>
             <w10:wrap type="none"/>
             <w10:anchorlock/>
           </v:shape>
-          <o:OLEObject Type="Embed" ProgID="Equation.DSMT4" ShapeID="_x0000_i1047" DrawAspect="Content" ObjectID="_1468075747" r:id="rId49">
+          <o:OLEObject Type="Embed" ProgID="Equation.DSMT4" ShapeID="_x0000_i1047" DrawAspect="Content" ObjectID="_1468075746" r:id="rId48">
             <o:LockedField>false</o:LockedField>
           </o:OLEObject>
         </w:object>
@@ -18754,12 +18789,12 @@
             <v:path/>
             <v:fill on="f" alignshape="1" focussize="0,0"/>
             <v:stroke on="f"/>
-            <v:imagedata r:id="rId52" grayscale="f" bilevel="f" o:title=""/>
+            <v:imagedata r:id="rId51" grayscale="f" bilevel="f" o:title=""/>
             <o:lock v:ext="edit" aspectratio="t"/>
             <w10:wrap type="none"/>
             <w10:anchorlock/>
           </v:shape>
-          <o:OLEObject Type="Embed" ProgID="Equation.DSMT4" ShapeID="_x0000_i1048" DrawAspect="Content" ObjectID="_1468075748" r:id="rId51">
+          <o:OLEObject Type="Embed" ProgID="Equation.DSMT4" ShapeID="_x0000_i1048" DrawAspect="Content" ObjectID="_1468075747" r:id="rId50">
             <o:LockedField>false</o:LockedField>
           </o:OLEObject>
         </w:object>
@@ -18866,12 +18901,12 @@
             <v:path/>
             <v:fill on="f" alignshape="1" focussize="0,0"/>
             <v:stroke on="f"/>
-            <v:imagedata r:id="rId54" grayscale="f" bilevel="f" o:title=""/>
+            <v:imagedata r:id="rId53" grayscale="f" bilevel="f" o:title=""/>
             <o:lock v:ext="edit" aspectratio="t"/>
             <w10:wrap type="none"/>
             <w10:anchorlock/>
           </v:shape>
-          <o:OLEObject Type="Embed" ProgID="Equation.3" ShapeID="_x0000_i1049" DrawAspect="Content" ObjectID="_1468075749" r:id="rId53">
+          <o:OLEObject Type="Embed" ProgID="Equation.3" ShapeID="_x0000_i1049" DrawAspect="Content" ObjectID="_1468075748" r:id="rId52">
             <o:LockedField>false</o:LockedField>
           </o:OLEObject>
         </w:object>
@@ -19012,12 +19047,12 @@
             <v:path/>
             <v:fill on="f" alignshape="1" focussize="0,0"/>
             <v:stroke on="f"/>
-            <v:imagedata r:id="rId56" grayscale="f" bilevel="f" o:title=""/>
+            <v:imagedata r:id="rId55" grayscale="f" bilevel="f" o:title=""/>
             <o:lock v:ext="edit" aspectratio="t"/>
             <w10:wrap type="none"/>
             <w10:anchorlock/>
           </v:shape>
-          <o:OLEObject Type="Embed" ProgID="Equation.3" ShapeID="_x0000_i1050" DrawAspect="Content" ObjectID="_1468075750" r:id="rId55">
+          <o:OLEObject Type="Embed" ProgID="Equation.3" ShapeID="_x0000_i1050" DrawAspect="Content" ObjectID="_1468075749" r:id="rId54">
             <o:LockedField>false</o:LockedField>
           </o:OLEObject>
         </w:object>
@@ -19097,12 +19132,12 @@
             <v:path/>
             <v:fill on="f" alignshape="1" focussize="0,0"/>
             <v:stroke on="f"/>
-            <v:imagedata r:id="rId58" grayscale="f" bilevel="f" o:title=""/>
+            <v:imagedata r:id="rId57" grayscale="f" bilevel="f" o:title=""/>
             <o:lock v:ext="edit" aspectratio="t"/>
             <w10:wrap type="none"/>
             <w10:anchorlock/>
           </v:shape>
-          <o:OLEObject Type="Embed" ProgID="Equation.3" ShapeID="_x0000_i1051" DrawAspect="Content" ObjectID="_1468075751" r:id="rId57">
+          <o:OLEObject Type="Embed" ProgID="Equation.3" ShapeID="_x0000_i1051" DrawAspect="Content" ObjectID="_1468075750" r:id="rId56">
             <o:LockedField>false</o:LockedField>
           </o:OLEObject>
         </w:object>
@@ -19370,12 +19405,12 @@
             <v:path/>
             <v:fill on="f" alignshape="1" focussize="0,0"/>
             <v:stroke on="f"/>
-            <v:imagedata r:id="rId60" grayscale="f" bilevel="f" o:title=""/>
+            <v:imagedata r:id="rId59" grayscale="f" bilevel="f" o:title=""/>
             <o:lock v:ext="edit" aspectratio="t"/>
             <w10:wrap type="none"/>
             <w10:anchorlock/>
           </v:shape>
-          <o:OLEObject Type="Embed" ProgID="Equation.3" ShapeID="_x0000_i1052" DrawAspect="Content" ObjectID="_1468075752" r:id="rId59">
+          <o:OLEObject Type="Embed" ProgID="Equation.3" ShapeID="_x0000_i1052" DrawAspect="Content" ObjectID="_1468075751" r:id="rId58">
             <o:LockedField>false</o:LockedField>
           </o:OLEObject>
         </w:object>
@@ -19404,12 +19439,12 @@
             <v:path/>
             <v:fill on="f" alignshape="1" focussize="0,0"/>
             <v:stroke on="f"/>
-            <v:imagedata r:id="rId62" grayscale="f" bilevel="f" o:title=""/>
+            <v:imagedata r:id="rId61" grayscale="f" bilevel="f" o:title=""/>
             <o:lock v:ext="edit" aspectratio="t"/>
             <w10:wrap type="none"/>
             <w10:anchorlock/>
           </v:shape>
-          <o:OLEObject Type="Embed" ProgID="Equation.3" ShapeID="_x0000_i1053" DrawAspect="Content" ObjectID="_1468075753" r:id="rId61">
+          <o:OLEObject Type="Embed" ProgID="Equation.3" ShapeID="_x0000_i1053" DrawAspect="Content" ObjectID="_1468075752" r:id="rId60">
             <o:LockedField>false</o:LockedField>
           </o:OLEObject>
         </w:object>
@@ -19475,12 +19510,12 @@
             <v:path/>
             <v:fill on="f" alignshape="1" focussize="0,0"/>
             <v:stroke on="f"/>
-            <v:imagedata r:id="rId64" grayscale="f" bilevel="f" o:title=""/>
+            <v:imagedata r:id="rId63" grayscale="f" bilevel="f" o:title=""/>
             <o:lock v:ext="edit" aspectratio="t"/>
             <w10:wrap type="none"/>
             <w10:anchorlock/>
           </v:shape>
-          <o:OLEObject Type="Embed" ProgID="Equation.3" ShapeID="_x0000_i1054" DrawAspect="Content" ObjectID="_1468075754" r:id="rId63">
+          <o:OLEObject Type="Embed" ProgID="Equation.3" ShapeID="_x0000_i1054" DrawAspect="Content" ObjectID="_1468075753" r:id="rId62">
             <o:LockedField>false</o:LockedField>
           </o:OLEObject>
         </w:object>
@@ -19538,12 +19573,12 @@
             <v:path/>
             <v:fill on="f" alignshape="1" focussize="0,0"/>
             <v:stroke on="f"/>
-            <v:imagedata r:id="rId66" grayscale="f" bilevel="f" o:title=""/>
+            <v:imagedata r:id="rId65" grayscale="f" bilevel="f" o:title=""/>
             <o:lock v:ext="edit" aspectratio="t"/>
             <w10:wrap type="none"/>
             <w10:anchorlock/>
           </v:shape>
-          <o:OLEObject Type="Embed" ProgID="Equation.3" ShapeID="_x0000_i1055" DrawAspect="Content" ObjectID="_1468075755" r:id="rId65">
+          <o:OLEObject Type="Embed" ProgID="Equation.3" ShapeID="_x0000_i1055" DrawAspect="Content" ObjectID="_1468075754" r:id="rId64">
             <o:LockedField>false</o:LockedField>
           </o:OLEObject>
         </w:object>
@@ -19600,12 +19635,12 @@
             <v:path/>
             <v:fill on="f" alignshape="1" focussize="0,0"/>
             <v:stroke on="f"/>
-            <v:imagedata r:id="rId68" grayscale="f" bilevel="f" o:title=""/>
+            <v:imagedata r:id="rId67" grayscale="f" bilevel="f" o:title=""/>
             <o:lock v:ext="edit" aspectratio="t"/>
             <w10:wrap type="none"/>
             <w10:anchorlock/>
           </v:shape>
-          <o:OLEObject Type="Embed" ProgID="Equation.3" ShapeID="_x0000_i1056" DrawAspect="Content" ObjectID="_1468075756" r:id="rId67">
+          <o:OLEObject Type="Embed" ProgID="Equation.3" ShapeID="_x0000_i1056" DrawAspect="Content" ObjectID="_1468075755" r:id="rId66">
             <o:LockedField>false</o:LockedField>
           </o:OLEObject>
         </w:object>
@@ -19662,12 +19697,12 @@
             <v:path/>
             <v:fill on="f" alignshape="1" focussize="0,0"/>
             <v:stroke on="f"/>
-            <v:imagedata r:id="rId70" grayscale="f" bilevel="f" o:title=""/>
+            <v:imagedata r:id="rId69" grayscale="f" bilevel="f" o:title=""/>
             <o:lock v:ext="edit" aspectratio="t"/>
             <w10:wrap type="none"/>
             <w10:anchorlock/>
           </v:shape>
-          <o:OLEObject Type="Embed" ProgID="Equation.3" ShapeID="_x0000_i1057" DrawAspect="Content" ObjectID="_1468075757" r:id="rId69">
+          <o:OLEObject Type="Embed" ProgID="Equation.3" ShapeID="_x0000_i1057" DrawAspect="Content" ObjectID="_1468075756" r:id="rId68">
             <o:LockedField>false</o:LockedField>
           </o:OLEObject>
         </w:object>
@@ -19724,12 +19759,12 @@
             <v:path/>
             <v:fill on="f" alignshape="1" focussize="0,0"/>
             <v:stroke on="f"/>
-            <v:imagedata r:id="rId72" grayscale="f" bilevel="f" o:title=""/>
+            <v:imagedata r:id="rId71" grayscale="f" bilevel="f" o:title=""/>
             <o:lock v:ext="edit" aspectratio="t"/>
             <w10:wrap type="none"/>
             <w10:anchorlock/>
           </v:shape>
-          <o:OLEObject Type="Embed" ProgID="Equation.3" ShapeID="_x0000_i1058" DrawAspect="Content" ObjectID="_1468075758" r:id="rId71">
+          <o:OLEObject Type="Embed" ProgID="Equation.3" ShapeID="_x0000_i1058" DrawAspect="Content" ObjectID="_1468075757" r:id="rId70">
             <o:LockedField>false</o:LockedField>
           </o:OLEObject>
         </w:object>
@@ -19816,12 +19851,12 @@
             <v:path/>
             <v:fill on="f" alignshape="1" focussize="0,0"/>
             <v:stroke on="f"/>
-            <v:imagedata r:id="rId68" grayscale="f" bilevel="f" o:title=""/>
+            <v:imagedata r:id="rId67" grayscale="f" bilevel="f" o:title=""/>
             <o:lock v:ext="edit" aspectratio="t"/>
             <w10:wrap type="none"/>
             <w10:anchorlock/>
           </v:shape>
-          <o:OLEObject Type="Embed" ProgID="Equation.3" ShapeID="_x0000_i1059" DrawAspect="Content" ObjectID="_1468075759" r:id="rId73">
+          <o:OLEObject Type="Embed" ProgID="Equation.3" ShapeID="_x0000_i1059" DrawAspect="Content" ObjectID="_1468075758" r:id="rId72">
             <o:LockedField>false</o:LockedField>
           </o:OLEObject>
         </w:object>
@@ -19851,12 +19886,12 @@
             <v:path/>
             <v:fill on="f" alignshape="1" focussize="0,0"/>
             <v:stroke on="f"/>
-            <v:imagedata r:id="rId75" grayscale="f" bilevel="f" o:title=""/>
+            <v:imagedata r:id="rId74" grayscale="f" bilevel="f" o:title=""/>
             <o:lock v:ext="edit" aspectratio="t"/>
             <w10:wrap type="none"/>
             <w10:anchorlock/>
           </v:shape>
-          <o:OLEObject Type="Embed" ProgID="Equation.3" ShapeID="_x0000_i1060" DrawAspect="Content" ObjectID="_1468075760" r:id="rId74">
+          <o:OLEObject Type="Embed" ProgID="Equation.3" ShapeID="_x0000_i1060" DrawAspect="Content" ObjectID="_1468075759" r:id="rId73">
             <o:LockedField>false</o:LockedField>
           </o:OLEObject>
         </w:object>
@@ -19886,12 +19921,12 @@
             <v:path/>
             <v:fill on="f" alignshape="1" focussize="0,0"/>
             <v:stroke on="f"/>
-            <v:imagedata r:id="rId77" grayscale="f" bilevel="f" o:title=""/>
+            <v:imagedata r:id="rId76" grayscale="f" bilevel="f" o:title=""/>
             <o:lock v:ext="edit" aspectratio="t"/>
             <w10:wrap type="none"/>
             <w10:anchorlock/>
           </v:shape>
-          <o:OLEObject Type="Embed" ProgID="Equation.3" ShapeID="_x0000_i1061" DrawAspect="Content" ObjectID="_1468075761" r:id="rId76">
+          <o:OLEObject Type="Embed" ProgID="Equation.3" ShapeID="_x0000_i1061" DrawAspect="Content" ObjectID="_1468075760" r:id="rId75">
             <o:LockedField>false</o:LockedField>
           </o:OLEObject>
         </w:object>
@@ -19941,12 +19976,12 @@
             <v:path/>
             <v:fill on="f" alignshape="1" focussize="0,0"/>
             <v:stroke on="f"/>
-            <v:imagedata r:id="rId79" grayscale="f" bilevel="f" o:title=""/>
+            <v:imagedata r:id="rId78" grayscale="f" bilevel="f" o:title=""/>
             <o:lock v:ext="edit" aspectratio="t"/>
             <w10:wrap type="none"/>
             <w10:anchorlock/>
           </v:shape>
-          <o:OLEObject Type="Embed" ProgID="Equation.3" ShapeID="_x0000_i1062" DrawAspect="Content" ObjectID="_1468075762" r:id="rId78">
+          <o:OLEObject Type="Embed" ProgID="Equation.3" ShapeID="_x0000_i1062" DrawAspect="Content" ObjectID="_1468075761" r:id="rId77">
             <o:LockedField>false</o:LockedField>
           </o:OLEObject>
         </w:object>
@@ -20003,12 +20038,12 @@
             <v:path/>
             <v:fill on="f" alignshape="1" focussize="0,0"/>
             <v:stroke on="f"/>
-            <v:imagedata r:id="rId81" grayscale="f" bilevel="f" o:title=""/>
+            <v:imagedata r:id="rId80" grayscale="f" bilevel="f" o:title=""/>
             <o:lock v:ext="edit" aspectratio="t"/>
             <w10:wrap type="none"/>
             <w10:anchorlock/>
           </v:shape>
-          <o:OLEObject Type="Embed" ProgID="Equation.3" ShapeID="_x0000_i1063" DrawAspect="Content" ObjectID="_1468075763" r:id="rId80">
+          <o:OLEObject Type="Embed" ProgID="Equation.3" ShapeID="_x0000_i1063" DrawAspect="Content" ObjectID="_1468075762" r:id="rId79">
             <o:LockedField>false</o:LockedField>
           </o:OLEObject>
         </w:object>
@@ -20074,12 +20109,12 @@
             <v:path/>
             <v:fill on="f" alignshape="1" focussize="0,0"/>
             <v:stroke on="f"/>
-            <v:imagedata r:id="rId83" grayscale="f" bilevel="f" o:title=""/>
+            <v:imagedata r:id="rId82" grayscale="f" bilevel="f" o:title=""/>
             <o:lock v:ext="edit" aspectratio="t"/>
             <w10:wrap type="none"/>
             <w10:anchorlock/>
           </v:shape>
-          <o:OLEObject Type="Embed" ProgID="Equation.3" ShapeID="_x0000_i1064" DrawAspect="Content" ObjectID="_1468075764" r:id="rId82">
+          <o:OLEObject Type="Embed" ProgID="Equation.3" ShapeID="_x0000_i1064" DrawAspect="Content" ObjectID="_1468075763" r:id="rId81">
             <o:LockedField>false</o:LockedField>
           </o:OLEObject>
         </w:object>
@@ -20109,12 +20144,12 @@
             <v:path/>
             <v:fill on="f" alignshape="1" focussize="0,0"/>
             <v:stroke on="f"/>
-            <v:imagedata r:id="rId85" grayscale="f" bilevel="f" o:title=""/>
+            <v:imagedata r:id="rId84" grayscale="f" bilevel="f" o:title=""/>
             <o:lock v:ext="edit" aspectratio="t"/>
             <w10:wrap type="none"/>
             <w10:anchorlock/>
           </v:shape>
-          <o:OLEObject Type="Embed" ProgID="Equation.3" ShapeID="_x0000_i1065" DrawAspect="Content" ObjectID="_1468075765" r:id="rId84">
+          <o:OLEObject Type="Embed" ProgID="Equation.3" ShapeID="_x0000_i1065" DrawAspect="Content" ObjectID="_1468075764" r:id="rId83">
             <o:LockedField>false</o:LockedField>
           </o:OLEObject>
         </w:object>
@@ -20143,12 +20178,12 @@
             <v:path/>
             <v:fill on="f" alignshape="1" focussize="0,0"/>
             <v:stroke on="f"/>
-            <v:imagedata r:id="rId87" grayscale="f" bilevel="f" o:title=""/>
+            <v:imagedata r:id="rId86" grayscale="f" bilevel="f" o:title=""/>
             <o:lock v:ext="edit" aspectratio="t"/>
             <w10:wrap type="none"/>
             <w10:anchorlock/>
           </v:shape>
-          <o:OLEObject Type="Embed" ProgID="Equation.3" ShapeID="_x0000_i1066" DrawAspect="Content" ObjectID="_1468075766" r:id="rId86">
+          <o:OLEObject Type="Embed" ProgID="Equation.3" ShapeID="_x0000_i1066" DrawAspect="Content" ObjectID="_1468075765" r:id="rId85">
             <o:LockedField>false</o:LockedField>
           </o:OLEObject>
         </w:object>
@@ -20197,12 +20232,12 @@
             <v:path/>
             <v:fill on="f" alignshape="1" focussize="0,0"/>
             <v:stroke on="f"/>
-            <v:imagedata r:id="rId89" grayscale="f" bilevel="f" o:title=""/>
+            <v:imagedata r:id="rId88" grayscale="f" bilevel="f" o:title=""/>
             <o:lock v:ext="edit" aspectratio="t"/>
             <w10:wrap type="none"/>
             <w10:anchorlock/>
           </v:shape>
-          <o:OLEObject Type="Embed" ProgID="Equation.3" ShapeID="_x0000_i1067" DrawAspect="Content" ObjectID="_1468075767" r:id="rId88">
+          <o:OLEObject Type="Embed" ProgID="Equation.3" ShapeID="_x0000_i1067" DrawAspect="Content" ObjectID="_1468075766" r:id="rId87">
             <o:LockedField>false</o:LockedField>
           </o:OLEObject>
         </w:object>
@@ -20288,12 +20323,12 @@
             <v:path/>
             <v:fill on="f" alignshape="1" focussize="0,0"/>
             <v:stroke on="f"/>
-            <v:imagedata r:id="rId91" grayscale="f" bilevel="f" o:title=""/>
+            <v:imagedata r:id="rId90" grayscale="f" bilevel="f" o:title=""/>
             <o:lock v:ext="edit" aspectratio="t"/>
             <w10:wrap type="none"/>
             <w10:anchorlock/>
           </v:shape>
-          <o:OLEObject Type="Embed" ProgID="Equation.3" ShapeID="_x0000_i1068" DrawAspect="Content" ObjectID="_1468075768" r:id="rId90">
+          <o:OLEObject Type="Embed" ProgID="Equation.3" ShapeID="_x0000_i1068" DrawAspect="Content" ObjectID="_1468075767" r:id="rId89">
             <o:LockedField>false</o:LockedField>
           </o:OLEObject>
         </w:object>
@@ -20359,12 +20394,12 @@
             <v:path/>
             <v:fill on="f" alignshape="1" focussize="0,0"/>
             <v:stroke on="f"/>
-            <v:imagedata r:id="rId93" grayscale="f" bilevel="f" o:title=""/>
+            <v:imagedata r:id="rId92" grayscale="f" bilevel="f" o:title=""/>
             <o:lock v:ext="edit" aspectratio="t"/>
             <w10:wrap type="none"/>
             <w10:anchorlock/>
           </v:shape>
-          <o:OLEObject Type="Embed" ProgID="Equation.3" ShapeID="_x0000_i1069" DrawAspect="Content" ObjectID="_1468075769" r:id="rId92">
+          <o:OLEObject Type="Embed" ProgID="Equation.3" ShapeID="_x0000_i1069" DrawAspect="Content" ObjectID="_1468075768" r:id="rId91">
             <o:LockedField>false</o:LockedField>
           </o:OLEObject>
         </w:object>
@@ -20420,12 +20455,12 @@
             <v:path/>
             <v:fill on="f" alignshape="1" focussize="0,0"/>
             <v:stroke on="f"/>
-            <v:imagedata r:id="rId95" grayscale="f" bilevel="f" o:title=""/>
+            <v:imagedata r:id="rId94" grayscale="f" bilevel="f" o:title=""/>
             <o:lock v:ext="edit" aspectratio="t"/>
             <w10:wrap type="none"/>
             <w10:anchorlock/>
           </v:shape>
-          <o:OLEObject Type="Embed" ProgID="Equation.3" ShapeID="_x0000_i1070" DrawAspect="Content" ObjectID="_1468075770" r:id="rId94">
+          <o:OLEObject Type="Embed" ProgID="Equation.3" ShapeID="_x0000_i1070" DrawAspect="Content" ObjectID="_1468075769" r:id="rId93">
             <o:LockedField>false</o:LockedField>
           </o:OLEObject>
         </w:object>
@@ -20516,12 +20551,12 @@
             <v:path/>
             <v:fill on="f" alignshape="1" focussize="0,0"/>
             <v:stroke on="f"/>
-            <v:imagedata r:id="rId97" grayscale="f" bilevel="f" o:title=""/>
+            <v:imagedata r:id="rId96" grayscale="f" bilevel="f" o:title=""/>
             <o:lock v:ext="edit" aspectratio="t"/>
             <w10:wrap type="none"/>
             <w10:anchorlock/>
           </v:shape>
-          <o:OLEObject Type="Embed" ProgID="Equation.3" ShapeID="_x0000_i1071" DrawAspect="Content" ObjectID="_1468075771" r:id="rId96">
+          <o:OLEObject Type="Embed" ProgID="Equation.3" ShapeID="_x0000_i1071" DrawAspect="Content" ObjectID="_1468075770" r:id="rId95">
             <o:LockedField>false</o:LockedField>
           </o:OLEObject>
         </w:object>
@@ -20586,12 +20621,12 @@
             <v:path/>
             <v:fill on="f" alignshape="1" focussize="0,0"/>
             <v:stroke on="f"/>
-            <v:imagedata r:id="rId99" grayscale="f" bilevel="f" o:title=""/>
+            <v:imagedata r:id="rId98" grayscale="f" bilevel="f" o:title=""/>
             <o:lock v:ext="edit" aspectratio="t"/>
             <w10:wrap type="none"/>
             <w10:anchorlock/>
           </v:shape>
-          <o:OLEObject Type="Embed" ProgID="Equation.3" ShapeID="_x0000_i1072" DrawAspect="Content" ObjectID="_1468075772" r:id="rId98">
+          <o:OLEObject Type="Embed" ProgID="Equation.3" ShapeID="_x0000_i1072" DrawAspect="Content" ObjectID="_1468075771" r:id="rId97">
             <o:LockedField>false</o:LockedField>
           </o:OLEObject>
         </w:object>
@@ -20657,12 +20692,12 @@
             <v:path/>
             <v:fill on="f" alignshape="1" focussize="0,0"/>
             <v:stroke on="f"/>
-            <v:imagedata r:id="rId101" grayscale="f" bilevel="f" o:title=""/>
+            <v:imagedata r:id="rId100" grayscale="f" bilevel="f" o:title=""/>
             <o:lock v:ext="edit" aspectratio="t"/>
             <w10:wrap type="none"/>
             <w10:anchorlock/>
           </v:shape>
-          <o:OLEObject Type="Embed" ProgID="Equation.3" ShapeID="_x0000_i1073" DrawAspect="Content" ObjectID="_1468075773" r:id="rId100">
+          <o:OLEObject Type="Embed" ProgID="Equation.3" ShapeID="_x0000_i1073" DrawAspect="Content" ObjectID="_1468075772" r:id="rId99">
             <o:LockedField>false</o:LockedField>
           </o:OLEObject>
         </w:object>
@@ -20767,12 +20802,12 @@
             <v:path/>
             <v:fill on="f" alignshape="1" focussize="0,0"/>
             <v:stroke on="f"/>
-            <v:imagedata r:id="rId103" grayscale="f" bilevel="f" o:title=""/>
+            <v:imagedata r:id="rId102" grayscale="f" bilevel="f" o:title=""/>
             <o:lock v:ext="edit" aspectratio="t"/>
             <w10:wrap type="none"/>
             <w10:anchorlock/>
           </v:shape>
-          <o:OLEObject Type="Embed" ProgID="Equation.3" ShapeID="_x0000_i1074" DrawAspect="Content" ObjectID="_1468075774" r:id="rId102">
+          <o:OLEObject Type="Embed" ProgID="Equation.3" ShapeID="_x0000_i1074" DrawAspect="Content" ObjectID="_1468075773" r:id="rId101">
             <o:LockedField>false</o:LockedField>
           </o:OLEObject>
         </w:object>
@@ -20847,12 +20882,12 @@
             <v:path/>
             <v:fill on="f" alignshape="1" focussize="0,0"/>
             <v:stroke on="f"/>
-            <v:imagedata r:id="rId105" grayscale="f" bilevel="f" o:title=""/>
+            <v:imagedata r:id="rId104" grayscale="f" bilevel="f" o:title=""/>
             <o:lock v:ext="edit" aspectratio="t"/>
             <w10:wrap type="none"/>
             <w10:anchorlock/>
           </v:shape>
-          <o:OLEObject Type="Embed" ProgID="Equation.3" ShapeID="_x0000_i1075" DrawAspect="Content" ObjectID="_1468075775" r:id="rId104">
+          <o:OLEObject Type="Embed" ProgID="Equation.3" ShapeID="_x0000_i1075" DrawAspect="Content" ObjectID="_1468075774" r:id="rId103">
             <o:LockedField>false</o:LockedField>
           </o:OLEObject>
         </w:object>
@@ -20917,12 +20952,12 @@
             <v:path/>
             <v:fill on="f" alignshape="1" focussize="0,0"/>
             <v:stroke on="f"/>
-            <v:imagedata r:id="rId107" grayscale="f" bilevel="f" o:title=""/>
+            <v:imagedata r:id="rId106" grayscale="f" bilevel="f" o:title=""/>
             <o:lock v:ext="edit" aspectratio="t"/>
             <w10:wrap type="none"/>
             <w10:anchorlock/>
           </v:shape>
-          <o:OLEObject Type="Embed" ProgID="Equation.3" ShapeID="_x0000_i1076" DrawAspect="Content" ObjectID="_1468075776" r:id="rId106">
+          <o:OLEObject Type="Embed" ProgID="Equation.3" ShapeID="_x0000_i1076" DrawAspect="Content" ObjectID="_1468075775" r:id="rId105">
             <o:LockedField>false</o:LockedField>
           </o:OLEObject>
         </w:object>
@@ -20987,12 +21022,12 @@
             <v:path/>
             <v:fill on="f" alignshape="1" focussize="0,0"/>
             <v:stroke on="f"/>
-            <v:imagedata r:id="rId109" grayscale="f" bilevel="f" o:title=""/>
+            <v:imagedata r:id="rId108" grayscale="f" bilevel="f" o:title=""/>
             <o:lock v:ext="edit" aspectratio="t"/>
             <w10:wrap type="none"/>
             <w10:anchorlock/>
           </v:shape>
-          <o:OLEObject Type="Embed" ProgID="Equation.3" ShapeID="_x0000_i1077" DrawAspect="Content" ObjectID="_1468075777" r:id="rId108">
+          <o:OLEObject Type="Embed" ProgID="Equation.3" ShapeID="_x0000_i1077" DrawAspect="Content" ObjectID="_1468075776" r:id="rId107">
             <o:LockedField>false</o:LockedField>
           </o:OLEObject>
         </w:object>
@@ -21092,12 +21127,12 @@
             <v:path/>
             <v:fill on="f" alignshape="1" focussize="0,0"/>
             <v:stroke on="f"/>
-            <v:imagedata r:id="rId111" grayscale="f" bilevel="f" o:title=""/>
+            <v:imagedata r:id="rId110" grayscale="f" bilevel="f" o:title=""/>
             <o:lock v:ext="edit" aspectratio="t"/>
             <w10:wrap type="none"/>
             <w10:anchorlock/>
           </v:shape>
-          <o:OLEObject Type="Embed" ProgID="Equation.3" ShapeID="_x0000_i1078" DrawAspect="Content" ObjectID="_1468075778" r:id="rId110">
+          <o:OLEObject Type="Embed" ProgID="Equation.3" ShapeID="_x0000_i1078" DrawAspect="Content" ObjectID="_1468075777" r:id="rId109">
             <o:LockedField>false</o:LockedField>
           </o:OLEObject>
         </w:object>
@@ -21398,12 +21433,12 @@
             <v:path/>
             <v:fill on="f" alignshape="1" focussize="0,0"/>
             <v:stroke on="f"/>
-            <v:imagedata r:id="rId113" grayscale="f" bilevel="f" o:title=""/>
+            <v:imagedata r:id="rId112" grayscale="f" bilevel="f" o:title=""/>
             <o:lock v:ext="edit" aspectratio="t"/>
             <w10:wrap type="none"/>
             <w10:anchorlock/>
           </v:shape>
-          <o:OLEObject Type="Embed" ProgID="Equation.DSMT4" ShapeID="_x0000_i1079" DrawAspect="Content" ObjectID="_1468075779" r:id="rId112">
+          <o:OLEObject Type="Embed" ProgID="Equation.DSMT4" ShapeID="_x0000_i1079" DrawAspect="Content" ObjectID="_1468075778" r:id="rId111">
             <o:LockedField>false</o:LockedField>
           </o:OLEObject>
         </w:object>
@@ -21468,12 +21503,12 @@
             <v:path/>
             <v:fill on="f" alignshape="1" focussize="0,0"/>
             <v:stroke on="f"/>
-            <v:imagedata r:id="rId115" grayscale="f" bilevel="f" o:title=""/>
+            <v:imagedata r:id="rId114" grayscale="f" bilevel="f" o:title=""/>
             <o:lock v:ext="edit" aspectratio="t"/>
             <w10:wrap type="none"/>
             <w10:anchorlock/>
           </v:shape>
-          <o:OLEObject Type="Embed" ProgID="Equation.3" ShapeID="_x0000_i1080" DrawAspect="Content" ObjectID="_1468075780" r:id="rId114">
+          <o:OLEObject Type="Embed" ProgID="Equation.3" ShapeID="_x0000_i1080" DrawAspect="Content" ObjectID="_1468075779" r:id="rId113">
             <o:LockedField>false</o:LockedField>
           </o:OLEObject>
         </w:object>
@@ -21549,12 +21584,12 @@
             <v:path/>
             <v:fill on="f" alignshape="1" focussize="0,0"/>
             <v:stroke on="f"/>
-            <v:imagedata r:id="rId117" grayscale="f" bilevel="f" o:title=""/>
+            <v:imagedata r:id="rId116" grayscale="f" bilevel="f" o:title=""/>
             <o:lock v:ext="edit" aspectratio="t"/>
             <w10:wrap type="none"/>
             <w10:anchorlock/>
           </v:shape>
-          <o:OLEObject Type="Embed" ProgID="Equation.3" ShapeID="_x0000_i1081" DrawAspect="Content" ObjectID="_1468075781" r:id="rId116">
+          <o:OLEObject Type="Embed" ProgID="Equation.3" ShapeID="_x0000_i1081" DrawAspect="Content" ObjectID="_1468075780" r:id="rId115">
             <o:LockedField>false</o:LockedField>
           </o:OLEObject>
         </w:object>
@@ -21655,12 +21690,12 @@
             <v:path/>
             <v:fill on="f" alignshape="1" focussize="0,0"/>
             <v:stroke on="f"/>
-            <v:imagedata r:id="rId119" grayscale="f" bilevel="f" o:title=""/>
+            <v:imagedata r:id="rId118" grayscale="f" bilevel="f" o:title=""/>
             <o:lock v:ext="edit" aspectratio="t"/>
             <w10:wrap type="none"/>
             <w10:anchorlock/>
           </v:shape>
-          <o:OLEObject Type="Embed" ProgID="Equation.3" ShapeID="_x0000_i1082" DrawAspect="Content" ObjectID="_1468075782" r:id="rId118">
+          <o:OLEObject Type="Embed" ProgID="Equation.3" ShapeID="_x0000_i1082" DrawAspect="Content" ObjectID="_1468075781" r:id="rId117">
             <o:LockedField>false</o:LockedField>
           </o:OLEObject>
         </w:object>
@@ -22443,8 +22478,8 @@
           <w:dstrike w:val="0"/>
         </w:rPr>
       </w:pPr>
-      <w:bookmarkStart w:id="6" w:name="_Toc23931226"/>
-      <w:bookmarkStart w:id="7" w:name="_Toc51320481"/>
+      <w:bookmarkStart w:id="6" w:name="_Toc51320481"/>
+      <w:bookmarkStart w:id="7" w:name="_Toc23931226"/>
       <w:r>
         <w:rPr>
           <w:rFonts w:hint="default" w:ascii="Times New Roman" w:hAnsi="Times New Roman" w:cs="Times New Roman"/>
@@ -22583,12 +22618,12 @@
             <v:path/>
             <v:fill on="f" alignshape="1" focussize="0,0"/>
             <v:stroke on="f"/>
-            <v:imagedata r:id="rId121" grayscale="f" bilevel="f" o:title=""/>
+            <v:imagedata r:id="rId120" grayscale="f" bilevel="f" o:title=""/>
             <o:lock v:ext="edit" aspectratio="t"/>
             <w10:wrap type="none"/>
             <w10:anchorlock/>
           </v:shape>
-          <o:OLEObject Type="Embed" ProgID="Equation.3" ShapeID="_x0000_i1083" DrawAspect="Content" ObjectID="_1468075783" r:id="rId120">
+          <o:OLEObject Type="Embed" ProgID="Equation.3" ShapeID="_x0000_i1083" DrawAspect="Content" ObjectID="_1468075782" r:id="rId119">
             <o:LockedField>false</o:LockedField>
           </o:OLEObject>
         </w:object>
@@ -23939,12 +23974,12 @@
             <v:path/>
             <v:fill on="f" alignshape="1" focussize="0,0"/>
             <v:stroke on="f"/>
-            <v:imagedata r:id="rId123" grayscale="f" bilevel="f" o:title=""/>
+            <v:imagedata r:id="rId122" grayscale="f" bilevel="f" o:title=""/>
             <o:lock v:ext="edit" aspectratio="t"/>
             <w10:wrap type="none"/>
             <w10:anchorlock/>
           </v:shape>
-          <o:OLEObject Type="Embed" ProgID="Equation.3" ShapeID="_x0000_i1084" DrawAspect="Content" ObjectID="_1468075784" r:id="rId122">
+          <o:OLEObject Type="Embed" ProgID="Equation.3" ShapeID="_x0000_i1084" DrawAspect="Content" ObjectID="_1468075783" r:id="rId121">
             <o:LockedField>false</o:LockedField>
           </o:OLEObject>
         </w:object>

</xml_diff>